<commit_message>
• M5: Data populated validation queries added
All milestones completed and added to the version control document. All steps are documented and descriptively explained in the document
</commit_message>
<xml_diff>
--- a/BushraMaaz_Version_Control_Doc_DBLab.docx
+++ b/BushraMaaz_Version_Control_Doc_DBLab.docx
@@ -2516,6 +2516,223 @@
           </w:p>
         </w:tc>
       </w:tr>
+      <w:tr>
+        <w:trPr/>
+        <w:tc>
+          <w:tcPr>
+            <w:shd w:val="clear" w:color="ffffff" w:fill="ffffff"/>
+            <w:tcBorders/>
+            <w:tcW w:w="1915" w:type="dxa"/>
+            <w:vAlign w:val="top"/>
+            <w:vMerge w:val="restart"/>
+          </w:tcPr>
+          <w:p>
+            <w:pPr>
+              <w:widowControl w:val="false"/>
+              <w:pBdr/>
+              <w:spacing w:after="80" w:before="0"/>
+              <w:ind/>
+              <w:jc w:val="center"/>
+              <w:rPr>
+                <w:rFonts w:hint="default" w:ascii="Calibri" w:hAnsi="Calibri" w:eastAsia="SimSun" w:cs="Calibri"/>
+                <w:sz w:val="24"/>
+                <w:szCs w:val="24"/>
+                <w:lang w:val="en-US"/>
+              </w:rPr>
+            </w:pPr>
+            <w:r>
+              <w:rPr>
+                <w:rFonts w:hint="default" w:ascii="Calibri" w:hAnsi="Calibri" w:eastAsia="SimSun" w:cs="Calibri"/>
+                <w:sz w:val="24"/>
+                <w:szCs w:val="24"/>
+                <w:lang w:val="en-US"/>
+              </w:rPr>
+              <w:t xml:space="preserve">Data Population (DML)</w:t>
+            </w:r>
+            <w:r>
+              <w:rPr>
+                <w:rFonts w:hint="default" w:ascii="Calibri" w:hAnsi="Calibri" w:eastAsia="SimSun" w:cs="Calibri"/>
+                <w:sz w:val="24"/>
+                <w:szCs w:val="24"/>
+                <w:lang w:val="en-US"/>
+              </w:rPr>
+            </w:r>
+          </w:p>
+        </w:tc>
+        <w:tc>
+          <w:tcPr>
+            <w:shd w:val="clear" w:color="ffffff" w:fill="ffffff"/>
+            <w:tcBorders/>
+            <w:tcW w:w="1915" w:type="dxa"/>
+            <w:vAlign w:val="top"/>
+            <w:vMerge w:val="restart"/>
+          </w:tcPr>
+          <w:p>
+            <w:pPr>
+              <w:widowControl w:val="false"/>
+              <w:pBdr/>
+              <w:spacing w:after="80" w:before="0"/>
+              <w:ind/>
+              <w:jc w:val="center"/>
+              <w:rPr>
+                <w:rFonts w:hint="default" w:ascii="Calibri" w:hAnsi="Calibri" w:eastAsia="SimSun" w:cs="Calibri"/>
+                <w:sz w:val="24"/>
+                <w:szCs w:val="24"/>
+                <w:lang w:val="en-US"/>
+              </w:rPr>
+            </w:pPr>
+            <w:r>
+              <w:rPr>
+                <w:rFonts w:hint="default" w:ascii="Calibri" w:hAnsi="Calibri" w:eastAsia="SimSun" w:cs="Calibri"/>
+                <w:sz w:val="24"/>
+                <w:szCs w:val="24"/>
+                <w:lang w:val="en-US"/>
+              </w:rPr>
+              <w:t xml:space="preserve">Added all the data from the CSV files to the table in the schema using sql commands</w:t>
+            </w:r>
+            <w:r>
+              <w:rPr>
+                <w:rFonts w:hint="default" w:ascii="Calibri" w:hAnsi="Calibri" w:eastAsia="SimSun" w:cs="Calibri"/>
+                <w:sz w:val="24"/>
+                <w:szCs w:val="24"/>
+                <w:lang w:val="en-US"/>
+              </w:rPr>
+            </w:r>
+          </w:p>
+        </w:tc>
+        <w:tc>
+          <w:tcPr>
+            <w:shd w:val="clear" w:color="ffffff" w:fill="ffffff"/>
+            <w:tcBorders/>
+            <w:tcW w:w="1915" w:type="dxa"/>
+            <w:vAlign w:val="top"/>
+            <w:vMerge w:val="restart"/>
+          </w:tcPr>
+          <w:p>
+            <w:pPr>
+              <w:widowControl w:val="false"/>
+              <w:pBdr/>
+              <w:spacing w:after="80" w:before="0"/>
+              <w:ind/>
+              <w:jc w:val="center"/>
+              <w:rPr>
+                <w:rFonts w:hint="default"/>
+                <w:sz w:val="24"/>
+                <w:szCs w:val="24"/>
+                <w:vertAlign w:val="baseline"/>
+                <w:lang w:val="en-US"/>
+              </w:rPr>
+            </w:pPr>
+            <w:r>
+              <w:rPr>
+                <w:rFonts w:hint="default"/>
+                <w:sz w:val="24"/>
+                <w:szCs w:val="24"/>
+                <w:vertAlign w:val="baseline"/>
+                <w:lang w:val="en-US"/>
+              </w:rPr>
+              <w:t xml:space="preserve">1.7</w:t>
+            </w:r>
+            <w:r>
+              <w:rPr>
+                <w:rFonts w:hint="default"/>
+                <w:sz w:val="24"/>
+                <w:szCs w:val="24"/>
+                <w:vertAlign w:val="baseline"/>
+                <w:lang w:val="en-US"/>
+              </w:rPr>
+            </w:r>
+          </w:p>
+        </w:tc>
+        <w:tc>
+          <w:tcPr>
+            <w:shd w:val="clear" w:color="ffffff" w:fill="ffffff"/>
+            <w:tcBorders/>
+            <w:tcW w:w="1915" w:type="dxa"/>
+            <w:vAlign w:val="top"/>
+            <w:vMerge w:val="restart"/>
+          </w:tcPr>
+          <w:p>
+            <w:pPr>
+              <w:widowControl w:val="false"/>
+              <w:pBdr/>
+              <w:spacing w:after="80" w:before="0"/>
+              <w:ind/>
+              <w:jc w:val="center"/>
+              <w:rPr>
+                <w:rFonts w:hint="default"/>
+                <w:sz w:val="24"/>
+                <w:szCs w:val="24"/>
+                <w:vertAlign w:val="baseline"/>
+                <w:lang w:val="en-US"/>
+              </w:rPr>
+            </w:pPr>
+            <w:r>
+              <w:rPr>
+                <w:rFonts w:hint="default"/>
+                <w:sz w:val="24"/>
+                <w:szCs w:val="24"/>
+                <w:vertAlign w:val="baseline"/>
+                <w:lang w:val="en-US"/>
+              </w:rPr>
+              <w:t xml:space="preserve">Completed</w:t>
+            </w:r>
+            <w:r>
+              <w:rPr>
+                <w:rFonts w:hint="default"/>
+                <w:sz w:val="24"/>
+                <w:szCs w:val="24"/>
+                <w:vertAlign w:val="baseline"/>
+                <w:lang w:val="en-US"/>
+              </w:rPr>
+            </w:r>
+          </w:p>
+        </w:tc>
+        <w:tc>
+          <w:tcPr>
+            <w:shd w:val="clear" w:color="ffffff" w:fill="ffffff"/>
+            <w:tcBorders/>
+            <w:tcW w:w="1915" w:type="dxa"/>
+            <w:vAlign w:val="top"/>
+            <w:vMerge w:val="restart"/>
+          </w:tcPr>
+          <w:p>
+            <w:pPr>
+              <w:widowControl w:val="false"/>
+              <w:pBdr/>
+              <w:spacing w:after="80" w:before="0"/>
+              <w:ind/>
+              <w:jc w:val="center"/>
+              <w:rPr>
+                <w:rFonts w:hint="default"/>
+                <w:sz w:val="24"/>
+                <w:szCs w:val="24"/>
+                <w:vertAlign w:val="baseline"/>
+                <w:lang w:val="en-US"/>
+              </w:rPr>
+            </w:pPr>
+            <w:r>
+              <w:rPr>
+                <w:rFonts w:hint="default"/>
+                <w:sz w:val="24"/>
+                <w:szCs w:val="24"/>
+                <w:vertAlign w:val="baseline"/>
+                <w:lang w:val="en-US"/>
+              </w:rPr>
+              <w:t xml:space="preserve">(16 May 2026)</w:t>
+            </w:r>
+            <w:r>
+              <w:rPr>
+                <w:rFonts w:hint="default"/>
+                <w:sz w:val="24"/>
+                <w:szCs w:val="24"/>
+                <w:vertAlign w:val="baseline"/>
+                <w:lang w:val="en-US"/>
+              </w:rPr>
+            </w:r>
+          </w:p>
+        </w:tc>
+      </w:tr>
     </w:tbl>
     <w:p>
       <w:pPr>
@@ -8210,12 +8427,7 @@
         <w:spacing w:after="0" w:afterAutospacing="1" w:before="0" w:beforeAutospacing="1"/>
         <w:ind w:left="360"/>
         <w:rPr>
-          <w:rFonts w:hint="default" w:eastAsia="SimSun" w:cs="Times New Roman"/>
-          <w:b/>
-          <w:bCs/>
-          <w:sz w:val="36"/>
-          <w:szCs w:val="36"/>
-          <w:lang w:val="en-US"/>
+          <w:highlight w:val="none"/>
         </w:rPr>
       </w:pPr>
       <w:r>
@@ -8243,6 +8455,189 @@
       </w:r>
       <w:r>
         <w:rPr>
+          <w:highlight w:val="none"/>
+        </w:rPr>
+      </w:r>
+    </w:p>
+    <w:p>
+      <w:pPr>
+        <w:keepNext w:val="false"/>
+        <w:keepLines w:val="false"/>
+        <w:widowControl w:val="true"/>
+        <w:numPr>
+          <w:ilvl w:val="0"/>
+          <w:numId w:val="0"/>
+        </w:numPr>
+        <w:suppressLineNumbers w:val="false"/>
+        <w:pBdr/>
+        <w:spacing w:after="0" w:afterAutospacing="1" w:before="0" w:beforeAutospacing="1"/>
+        <w:ind w:left="360"/>
+        <w:rPr>
+          <w:highlight w:val="none"/>
+        </w:rPr>
+      </w:pPr>
+      <w:r>
+        <w:rPr>
+          <w:highlight w:val="none"/>
+        </w:rPr>
+      </w:r>
+      <w:r>
+        <w:rPr>
+          <w:highlight w:val="none"/>
+        </w:rPr>
+      </w:r>
+      <w:r>
+        <w:rPr>
+          <w:highlight w:val="none"/>
+        </w:rPr>
+      </w:r>
+    </w:p>
+    <w:p>
+      <w:pPr>
+        <w:keepNext w:val="false"/>
+        <w:keepLines w:val="false"/>
+        <w:widowControl w:val="true"/>
+        <w:numPr>
+          <w:ilvl w:val="0"/>
+          <w:numId w:val="0"/>
+        </w:numPr>
+        <w:suppressLineNumbers w:val="false"/>
+        <w:pBdr/>
+        <w:spacing w:after="0" w:afterAutospacing="1" w:before="0" w:beforeAutospacing="1"/>
+        <w:ind w:left="360"/>
+        <w:rPr>
+          <w:highlight w:val="none"/>
+        </w:rPr>
+      </w:pPr>
+      <w:r>
+        <w:rPr>
+          <w:highlight w:val="none"/>
+        </w:rPr>
+      </w:r>
+      <w:r>
+        <w:rPr>
+          <w:highlight w:val="none"/>
+        </w:rPr>
+      </w:r>
+      <w:r>
+        <w:rPr>
+          <w:highlight w:val="none"/>
+        </w:rPr>
+      </w:r>
+    </w:p>
+    <w:p>
+      <w:pPr>
+        <w:keepNext w:val="false"/>
+        <w:keepLines w:val="false"/>
+        <w:widowControl w:val="true"/>
+        <w:numPr>
+          <w:ilvl w:val="0"/>
+          <w:numId w:val="0"/>
+        </w:numPr>
+        <w:suppressLineNumbers w:val="false"/>
+        <w:pBdr/>
+        <w:spacing w:after="0" w:afterAutospacing="1" w:before="0" w:beforeAutospacing="1"/>
+        <w:ind w:left="360"/>
+        <w:rPr>
+          <w:highlight w:val="none"/>
+        </w:rPr>
+      </w:pPr>
+      <w:r>
+        <w:rPr>
+          <w:highlight w:val="none"/>
+        </w:rPr>
+      </w:r>
+      <w:r>
+        <w:rPr>
+          <w:highlight w:val="none"/>
+        </w:rPr>
+      </w:r>
+      <w:r>
+        <w:rPr>
+          <w:highlight w:val="none"/>
+        </w:rPr>
+      </w:r>
+    </w:p>
+    <w:p>
+      <w:pPr>
+        <w:keepNext w:val="false"/>
+        <w:keepLines w:val="false"/>
+        <w:widowControl w:val="true"/>
+        <w:numPr>
+          <w:ilvl w:val="0"/>
+          <w:numId w:val="0"/>
+        </w:numPr>
+        <w:suppressLineNumbers w:val="false"/>
+        <w:pBdr/>
+        <w:spacing w:after="0" w:afterAutospacing="1" w:before="0" w:beforeAutospacing="1"/>
+        <w:ind w:left="360"/>
+        <w:rPr>
+          <w:highlight w:val="none"/>
+        </w:rPr>
+      </w:pPr>
+      <w:r>
+        <w:rPr>
+          <w:highlight w:val="none"/>
+        </w:rPr>
+      </w:r>
+      <w:r>
+        <w:rPr>
+          <w:highlight w:val="none"/>
+        </w:rPr>
+      </w:r>
+      <w:r>
+        <w:rPr>
+          <w:highlight w:val="none"/>
+        </w:rPr>
+      </w:r>
+    </w:p>
+    <w:p>
+      <w:pPr>
+        <w:keepNext w:val="false"/>
+        <w:keepLines w:val="false"/>
+        <w:widowControl w:val="true"/>
+        <w:numPr>
+          <w:ilvl w:val="0"/>
+          <w:numId w:val="0"/>
+        </w:numPr>
+        <w:suppressLineNumbers w:val="false"/>
+        <w:pBdr/>
+        <w:spacing w:after="0" w:afterAutospacing="1" w:before="0" w:beforeAutospacing="1"/>
+        <w:ind w:left="360"/>
+        <w:rPr>
+          <w:highlight w:val="none"/>
+        </w:rPr>
+      </w:pPr>
+      <w:r>
+        <w:rPr>
+          <w:highlight w:val="none"/>
+        </w:rPr>
+      </w:r>
+      <w:r>
+        <w:rPr>
+          <w:highlight w:val="none"/>
+        </w:rPr>
+      </w:r>
+      <w:r>
+        <w:rPr>
+          <w:highlight w:val="none"/>
+        </w:rPr>
+      </w:r>
+    </w:p>
+    <w:p>
+      <w:pPr>
+        <w:keepNext w:val="false"/>
+        <w:keepLines w:val="false"/>
+        <w:widowControl w:val="true"/>
+        <w:numPr>
+          <w:ilvl w:val="0"/>
+          <w:numId w:val="0"/>
+        </w:numPr>
+        <w:suppressLineNumbers w:val="false"/>
+        <w:pBdr/>
+        <w:spacing w:after="0" w:afterAutospacing="1" w:before="0" w:beforeAutospacing="1"/>
+        <w:ind w:left="360"/>
+        <w:rPr>
           <w:rFonts w:hint="default" w:eastAsia="SimSun" w:cs="Times New Roman"/>
           <w:b/>
           <w:bCs/>
@@ -8251,7 +8646,7 @@
           <w:highlight w:val="none"/>
           <w:lang w:val="en-US" w:bidi="en-US"/>
         </w:rPr>
-      </w:r>
+      </w:pPr>
       <w:r>
         <w:rPr>
           <w:rFonts w:hint="default" w:eastAsia="SimSun" w:cs="Times New Roman"/>
@@ -8259,6 +8654,237 @@
           <w:bCs/>
           <w:sz w:val="36"/>
           <w:szCs w:val="36"/>
+          <w:highlight w:val="none"/>
+          <w:lang w:val="en-US" w:bidi="en-US"/>
+        </w:rPr>
+      </w:r>
+      <w:r>
+        <w:rPr>
+          <w:rFonts w:hint="default" w:eastAsia="SimSun" w:cs="Times New Roman"/>
+          <w:b/>
+          <w:bCs/>
+          <w:sz w:val="36"/>
+          <w:szCs w:val="36"/>
+          <w:highlight w:val="none"/>
+          <w:lang w:val="en-US" w:bidi="en-US"/>
+        </w:rPr>
+        <w:t xml:space="preserve">Data Population (DML) </w:t>
+      </w:r>
+      <w:r>
+        <w:rPr>
+          <w:rFonts w:hint="default" w:eastAsia="SimSun" w:cs="Times New Roman"/>
+          <w:b/>
+          <w:bCs/>
+          <w:sz w:val="36"/>
+          <w:szCs w:val="36"/>
+          <w:highlight w:val="none"/>
+          <w:lang w:val="en-US" w:bidi="en-US"/>
+        </w:rPr>
+        <w:t xml:space="preserve">Milestone 5</w:t>
+      </w:r>
+      <w:r>
+        <w:rPr>
+          <w:rFonts w:hint="default" w:eastAsia="SimSun" w:cs="Times New Roman"/>
+          <w:b/>
+          <w:bCs/>
+          <w:sz w:val="36"/>
+          <w:szCs w:val="36"/>
+          <w:highlight w:val="none"/>
+          <w:lang w:val="en-US" w:bidi="en-US"/>
+        </w:rPr>
+      </w:r>
+    </w:p>
+    <w:p>
+      <w:pPr>
+        <w:keepNext w:val="false"/>
+        <w:keepLines w:val="false"/>
+        <w:widowControl w:val="true"/>
+        <w:numPr>
+          <w:ilvl w:val="0"/>
+          <w:numId w:val="0"/>
+        </w:numPr>
+        <w:suppressLineNumbers w:val="false"/>
+        <w:pBdr/>
+        <w:spacing w:after="0" w:afterAutospacing="1" w:before="0" w:beforeAutospacing="1"/>
+        <w:ind w:left="360"/>
+        <w:rPr>
+          <w:rFonts w:hint="default" w:eastAsia="SimSun" w:cs="Times New Roman"/>
+          <w:b w:val="0"/>
+          <w:bCs w:val="0"/>
+          <w:sz w:val="24"/>
+          <w:szCs w:val="24"/>
+          <w:highlight w:val="none"/>
+          <w:lang w:val="en-US" w:bidi="en-US"/>
+        </w:rPr>
+      </w:pPr>
+      <w:r>
+        <w:rPr>
+          <w:rFonts w:hint="default" w:eastAsia="SimSun" w:cs="Times New Roman"/>
+          <w:b/>
+          <w:bCs/>
+          <w:sz w:val="36"/>
+          <w:szCs w:val="36"/>
+          <w:highlight w:val="none"/>
+          <w:lang w:val="en-US" w:bidi="en-US"/>
+        </w:rPr>
+      </w:r>
+      <w:r>
+        <w:t xml:space="preserve">Data populated using LOAD DATA INFILE for all 9 table UPDATE and DELETE operations demonstrated with WHERE conditions validation queries added for row counts, NULL checks, and FK integrity.</w:t>
+      </w:r>
+      <w:r>
+        <w:rPr>
+          <w:rFonts w:hint="default" w:eastAsia="SimSun" w:cs="Times New Roman"/>
+          <w:b w:val="0"/>
+          <w:bCs w:val="0"/>
+          <w:sz w:val="24"/>
+          <w:szCs w:val="24"/>
+          <w:highlight w:val="none"/>
+          <w:lang w:val="en-US" w:bidi="en-US"/>
+        </w:rPr>
+        <w:t xml:space="preserve"> A screenshot at the end shows the data populated in the tables</w:t>
+      </w:r>
+      <w:r>
+        <w:rPr>
+          <w:rFonts w:hint="default" w:eastAsia="SimSun" w:cs="Times New Roman"/>
+          <w:b w:val="0"/>
+          <w:bCs w:val="0"/>
+          <w:sz w:val="24"/>
+          <w:szCs w:val="24"/>
+          <w:highlight w:val="none"/>
+        </w:rPr>
+      </w:r>
+    </w:p>
+    <w:p>
+      <w:pPr>
+        <w:keepNext w:val="false"/>
+        <w:keepLines w:val="false"/>
+        <w:widowControl w:val="true"/>
+        <w:numPr>
+          <w:ilvl w:val="0"/>
+          <w:numId w:val="0"/>
+        </w:numPr>
+        <w:suppressLineNumbers w:val="false"/>
+        <w:pBdr/>
+        <w:spacing w:after="0" w:afterAutospacing="1" w:before="0" w:beforeAutospacing="1"/>
+        <w:ind w:left="360"/>
+        <w:rPr>
+          <w:rFonts w:hint="default" w:eastAsia="SimSun" w:cs="Times New Roman"/>
+          <w:b w:val="0"/>
+          <w:bCs w:val="0"/>
+          <w:sz w:val="24"/>
+          <w:szCs w:val="24"/>
+          <w:highlight w:val="none"/>
+        </w:rPr>
+      </w:pPr>
+      <w:r>
+        <w:rPr>
+          <w:rFonts w:hint="default" w:eastAsia="SimSun" w:cs="Times New Roman"/>
+          <w:b w:val="0"/>
+          <w:bCs w:val="0"/>
+          <w:sz w:val="24"/>
+          <w:szCs w:val="24"/>
+          <w:highlight w:val="none"/>
+          <w:lang w:val="en-US" w:bidi="en-US"/>
+        </w:rPr>
+      </w:r>
+      <w:r>
+        <mc:AlternateContent>
+          <mc:Choice Requires="wpg">
+            <w:drawing>
+              <wp:inline xmlns:wp="http://schemas.openxmlformats.org/drawingml/2006/wordprocessingDrawing" distT="0" distB="0" distL="0" distR="0">
+                <wp:extent cx="3028950" cy="1694625"/>
+                <wp:effectExtent l="0" t="0" r="0" b="0"/>
+                <wp:docPr id="5" name=""/>
+                <wp:cNvGraphicFramePr>
+                  <a:graphicFrameLocks xmlns:a="http://schemas.openxmlformats.org/drawingml/2006/main" noChangeAspect="1"/>
+                </wp:cNvGraphicFramePr>
+                <a:graphic xmlns:a="http://schemas.openxmlformats.org/drawingml/2006/main">
+                  <a:graphicData uri="http://schemas.openxmlformats.org/drawingml/2006/picture">
+                    <pic:pic xmlns:pic="http://schemas.openxmlformats.org/drawingml/2006/picture">
+                      <pic:nvPicPr>
+                        <pic:cNvPr id="839201197" name=""/>
+                        <pic:cNvPicPr>
+                          <a:picLocks noChangeAspect="1"/>
+                        </pic:cNvPicPr>
+                        <pic:nvPr/>
+                      </pic:nvPicPr>
+                      <pic:blipFill rotWithShape="1">
+                        <a:blip r:embed="rId13"/>
+                        <a:stretch/>
+                      </pic:blipFill>
+                      <pic:spPr bwMode="auto">
+                        <a:xfrm flipH="0" flipV="0">
+                          <a:off x="0" y="0"/>
+                          <a:ext cx="3028950" cy="1694624"/>
+                        </a:xfrm>
+                        <a:prstGeom prst="rect">
+                          <a:avLst/>
+                        </a:prstGeom>
+                      </pic:spPr>
+                    </pic:pic>
+                  </a:graphicData>
+                </a:graphic>
+              </wp:inline>
+            </w:drawing>
+          </mc:Choice>
+          <mc:Fallback>
+            <w:pict>
+              <v:shapetype id="_x0000_t75" coordsize="21600,21600" o:spt="75" o:preferrelative="t" path="m@4@5l@4@11@9@11@9@5xe" filled="f" stroked="f">
+                <v:stroke joinstyle="miter"/>
+                <v:formulas>
+                  <v:f eqn="if lineDrawn pixelLineWidth 0"/>
+                  <v:f eqn="sum @0 1 0"/>
+                  <v:f eqn="sum 0 0 @1"/>
+                  <v:f eqn="prod @2 1 2"/>
+                  <v:f eqn="prod @3 21600 pixelWidth"/>
+                  <v:f eqn="prod @3 21600 pixelHeight"/>
+                  <v:f eqn="sum @0 0 1"/>
+                  <v:f eqn="prod @6 1 2"/>
+                  <v:f eqn="prod @7 21600 pixelWidth"/>
+                  <v:f eqn="sum @8 21600 0"/>
+                  <v:f eqn="prod @7 21600 pixelHeight"/>
+                  <v:f eqn="sum @10 21600 0"/>
+                </v:formulas>
+                <v:path o:extrusionok="f" gradientshapeok="t" o:connecttype="rect"/>
+                <o:lock v:ext="edit" aspectratio="t"/>
+              </v:shapetype>
+              <v:shape id="_x0000_i4" o:spid="_x0000_s4" type="#_x0000_t75" style="width:238.50pt;height:133.44pt;mso-wrap-distance-left:0.00pt;mso-wrap-distance-top:0.00pt;mso-wrap-distance-right:0.00pt;mso-wrap-distance-bottom:0.00pt;z-index:1;" stroked="false">
+                <v:imagedata r:id="rId13" o:title=""/>
+                <o:lock v:ext="edit" rotation="t"/>
+              </v:shape>
+            </w:pict>
+          </mc:Fallback>
+        </mc:AlternateContent>
+      </w:r>
+      <w:r>
+        <w:rPr>
+          <w:rFonts w:hint="default" w:eastAsia="SimSun" w:cs="Times New Roman"/>
+          <w:b w:val="0"/>
+          <w:bCs w:val="0"/>
+          <w:sz w:val="24"/>
+          <w:szCs w:val="24"/>
+          <w:highlight w:val="none"/>
+          <w:lang w:val="en-US" w:bidi="en-US"/>
+        </w:rPr>
+      </w:r>
+      <w:r>
+        <w:rPr>
+          <w:rFonts w:hint="default" w:eastAsia="SimSun" w:cs="Times New Roman"/>
+          <w:b w:val="0"/>
+          <w:bCs w:val="0"/>
+          <w:sz w:val="24"/>
+          <w:szCs w:val="24"/>
+          <w:highlight w:val="none"/>
+          <w:lang w:val="en-US" w:bidi="en-US"/>
+        </w:rPr>
+      </w:r>
+      <w:r>
+        <w:rPr>
+          <w:rFonts w:hint="default" w:eastAsia="SimSun" w:cs="Times New Roman"/>
+          <w:b w:val="0"/>
+          <w:bCs w:val="0"/>
+          <w:sz w:val="24"/>
+          <w:szCs w:val="24"/>
           <w:highlight w:val="none"/>
           <w:lang w:val="en-US" w:bidi="en-US"/>
         </w:rPr>

</xml_diff>